<commit_message>
Refresh Bible resource data for release 2026-09-28
</commit_message>
<xml_diff>
--- a/eng/docx/008.content.docx
+++ b/eng/docx/008.content.docx
@@ -2752,7 +2752,7 @@
         <w:rPr>
           <w:lang w:val="en_US" w:bidi="en_US"/>
         </w:rPr>
-        <w:t>Hamath, Hamathites, Lebo Hamath</w:t>
+        <w:t>Hamath, Hamathites, Lebo Hamath, Hamath Rabbah</w:t>
       </w:r>
       <w:r>
         <w:rPr>
@@ -2839,6 +2839,29 @@
           <w:lang w:val="en_US" w:bidi="en_US"/>
         </w:rPr>
         <w:t>Some versions translate “Lebo Hamath” as “entrance to Hamath.”</w:t>
+      </w:r>
+      <w:r>
+        <w:rPr>
+          <w:lang w:val="en_US" w:bidi="en_US"/>
+        </w:rPr>
+      </w:r>
+    </w:p>
+    <w:p>
+      <w:pPr>
+        <w:pStyle w:val="ListBullet"/>
+        <w:spacing w:line="240" w:lineRule="auto"/>
+        <w:ind w:left="720"/>
+      </w:pPr>
+      <w:r>
+        <w:rPr>
+          <w:lang w:val="en_US" w:bidi="en_US"/>
+        </w:rPr>
+      </w:r>
+      <w:r>
+        <w:rPr>
+          <w:lang w:val="en_US" w:bidi="en_US"/>
+        </w:rPr>
+        <w:t>Sometimes called “Hamath Rabbah” which means “great Hamath.”</w:t>
       </w:r>
       <w:r>
         <w:rPr>

</xml_diff>